<commit_message>
Remove estilo duplicado no Word das ementas
Co-Authored-By: Claude Opus 5.5 <noreply@anthropic.com>
Claude-Session: https://claude.ai/code/session_019Xe1XBVaT2Xj3U36hXQ1Zj
</commit_message>
<xml_diff>
--- a/ementas-mba-gestao-projetos.docx
+++ b/ementas-mba-gestao-projetos.docx
@@ -6465,13 +6465,6 @@
       <w:szCs w:val="36"/>
     </w:rPr>
   </w:style>
-  <w:style w:type="paragraph" w:styleId="ListParagraph">
-    <w:name w:val="List Paragraph"/>
-    <w:basedOn w:val="Normal"/>
-    <w:pPr>
-      <w:spacing w:after="60"/>
-    </w:pPr>
-  </w:style>
   <w:style w:type="paragraph" w:styleId="Heading1">
     <w:name w:val="Heading 1"/>
     <w:basedOn w:val="Normal"/>

</xml_diff>